<commit_message>
Videre med cambrigde analytica forløb. Ikke færdig.
</commit_message>
<xml_diff>
--- a/undervisningsforlob/cambridge_analytica/Overblik over forløb.docx
+++ b/undervisningsforlob/cambridge_analytica/Overblik over forløb.docx
@@ -136,6 +136,23 @@
     </w:p>
     <w:p>
       <w:r>
+        <w:t xml:space="preserve">Dokumentar: </w:t>
+      </w:r>
+      <w:hyperlink r:id="rId6" w:history="1">
+        <w:r>
+          <w:rPr>
+            <w:rStyle w:val="Hyperlink"/>
+          </w:rPr>
+          <w:t>Trumps datagenier (3)</w:t>
+        </w:r>
+      </w:hyperlink>
+      <w:r>
+        <w:t xml:space="preserve"> (35 min)</w:t>
+      </w:r>
+    </w:p>
+    <w:p/>
+    <w:p>
+      <w:r>
         <w:t>App:</w:t>
       </w:r>
     </w:p>
@@ -144,6 +161,9 @@
         <w:jc w:val="center"/>
       </w:pPr>
       <w:r>
+        <w:rPr>
+          <w:noProof/>
+        </w:rPr>
         <w:drawing>
           <wp:inline distT="0" distB="0" distL="0" distR="0" wp14:anchorId="63189FC6" wp14:editId="0C99AF14">
             <wp:extent cx="2118167" cy="1596529"/>
@@ -160,7 +180,7 @@
                     <pic:cNvPicPr/>
                   </pic:nvPicPr>
                   <pic:blipFill>
-                    <a:blip r:embed="rId6"/>
+                    <a:blip r:embed="rId7"/>
                     <a:stretch>
                       <a:fillRect/>
                     </a:stretch>
@@ -181,23 +201,699 @@
         </w:drawing>
       </w:r>
     </w:p>
-    <w:p/>
-    <w:p/>
+    <w:p>
+      <w:pPr>
+        <w:rPr>
+          <w:b/>
+          <w:bCs/>
+        </w:rPr>
+      </w:pPr>
+      <w:r>
+        <w:rPr>
+          <w:b/>
+          <w:bCs/>
+        </w:rPr>
+        <w:t>PP: OCEAN</w:t>
+      </w:r>
+    </w:p>
+    <w:p>
+      <w:r>
+        <w:t xml:space="preserve">Øvelse - OCEAN spørgeskema (20 udsagn, gruppering og +/- </w:t>
+      </w:r>
+      <w:proofErr w:type="spellStart"/>
+      <w:proofErr w:type="gramStart"/>
+      <w:r>
+        <w:t>valued</w:t>
+      </w:r>
+      <w:proofErr w:type="spellEnd"/>
+      <w:r>
+        <w:t xml:space="preserve"> )</w:t>
+      </w:r>
+      <w:proofErr w:type="gramEnd"/>
+    </w:p>
+    <w:p>
+      <w:r>
+        <w:t xml:space="preserve">Øvelse - implementering af OCEAN spørgeskema (implementering af app </w:t>
+      </w:r>
+      <w:proofErr w:type="spellStart"/>
+      <w:r>
+        <w:t>incl</w:t>
+      </w:r>
+      <w:proofErr w:type="spellEnd"/>
+      <w:r>
+        <w:t>. WE og UMC-opgaver)</w:t>
+      </w:r>
+    </w:p>
+    <w:p>
+      <w:r>
+        <w:t>Øvelse - implementering af OCEAN spørgeskema (ekstra udfordring)</w:t>
+      </w:r>
+      <w:r>
+        <w:t xml:space="preserve"> (standardisering af scores)</w:t>
+      </w:r>
+    </w:p>
     <w:p/>
     <w:p>
       <w:pPr>
         <w:rPr>
-          <w:lang w:val="en-US"/>
+          <w:bCs/>
+        </w:rPr>
+      </w:pPr>
+      <w:r>
+        <w:rPr>
+          <w:bCs/>
+        </w:rPr>
+        <w:t>”The Great Hack” på Netflix</w:t>
+      </w:r>
+    </w:p>
+    <w:tbl>
+      <w:tblPr>
+        <w:tblStyle w:val="Tabel-Gitter"/>
+        <w:tblW w:w="0" w:type="auto"/>
+        <w:tblBorders>
+          <w:top w:val="none" w:sz="0" w:space="0" w:color="auto"/>
+          <w:left w:val="none" w:sz="0" w:space="0" w:color="auto"/>
+          <w:bottom w:val="none" w:sz="0" w:space="0" w:color="auto"/>
+          <w:right w:val="none" w:sz="0" w:space="0" w:color="auto"/>
+          <w:insideH w:val="none" w:sz="0" w:space="0" w:color="auto"/>
+          <w:insideV w:val="none" w:sz="0" w:space="0" w:color="auto"/>
+        </w:tblBorders>
+        <w:tblLook w:val="04A0" w:firstRow="1" w:lastRow="0" w:firstColumn="1" w:lastColumn="0" w:noHBand="0" w:noVBand="1"/>
+      </w:tblPr>
+      <w:tblGrid>
+        <w:gridCol w:w="562"/>
+        <w:gridCol w:w="2127"/>
+      </w:tblGrid>
+      <w:tr>
+        <w:tc>
+          <w:tcPr>
+            <w:tcW w:w="562" w:type="dxa"/>
+            <w:shd w:val="clear" w:color="auto" w:fill="F288B9"/>
+          </w:tcPr>
+          <w:p>
+            <w:pPr>
+              <w:spacing w:after="0"/>
+              <w:rPr>
+                <w:bCs/>
+              </w:rPr>
+            </w:pPr>
+            <w:r>
+              <w:rPr>
+                <w:bCs/>
+                <w:noProof/>
+                <w14:ligatures w14:val="standardContextual"/>
+              </w:rPr>
+              <mc:AlternateContent>
+                <mc:Choice Requires="wps">
+                  <w:drawing>
+                    <wp:anchor distT="0" distB="0" distL="114300" distR="114300" simplePos="0" relativeHeight="251659264" behindDoc="0" locked="0" layoutInCell="1" allowOverlap="1" wp14:anchorId="180D8816" wp14:editId="795FF5F2">
+                      <wp:simplePos x="0" y="0"/>
+                      <wp:positionH relativeFrom="column">
+                        <wp:posOffset>154305</wp:posOffset>
+                      </wp:positionH>
+                      <wp:positionV relativeFrom="paragraph">
+                        <wp:posOffset>206375</wp:posOffset>
+                      </wp:positionV>
+                      <wp:extent cx="76200" cy="82550"/>
+                      <wp:effectExtent l="0" t="0" r="19050" b="12700"/>
+                      <wp:wrapNone/>
+                      <wp:docPr id="801550327" name="Ellipse 1"/>
+                      <wp:cNvGraphicFramePr/>
+                      <a:graphic xmlns:a="http://schemas.openxmlformats.org/drawingml/2006/main">
+                        <a:graphicData uri="http://schemas.microsoft.com/office/word/2010/wordprocessingShape">
+                          <wps:wsp>
+                            <wps:cNvSpPr/>
+                            <wps:spPr>
+                              <a:xfrm>
+                                <a:off x="0" y="0"/>
+                                <a:ext cx="76200" cy="82550"/>
+                              </a:xfrm>
+                              <a:prstGeom prst="ellipse">
+                                <a:avLst/>
+                              </a:prstGeom>
+                              <a:solidFill>
+                                <a:schemeClr val="bg1"/>
+                              </a:solidFill>
+                            </wps:spPr>
+                            <wps:style>
+                              <a:lnRef idx="2">
+                                <a:schemeClr val="dk1"/>
+                              </a:lnRef>
+                              <a:fillRef idx="1">
+                                <a:schemeClr val="lt1"/>
+                              </a:fillRef>
+                              <a:effectRef idx="0">
+                                <a:schemeClr val="dk1"/>
+                              </a:effectRef>
+                              <a:fontRef idx="minor">
+                                <a:schemeClr val="dk1"/>
+                              </a:fontRef>
+                            </wps:style>
+                            <wps:bodyPr rot="0" spcFirstLastPara="0" vertOverflow="overflow" horzOverflow="overflow" vert="horz" wrap="square" lIns="91440" tIns="45720" rIns="91440" bIns="45720" numCol="1" spcCol="0" rtlCol="0" fromWordArt="0" anchor="ctr" anchorCtr="0" forceAA="0" compatLnSpc="1">
+                              <a:prstTxWarp prst="textNoShape">
+                                <a:avLst/>
+                              </a:prstTxWarp>
+                              <a:noAutofit/>
+                            </wps:bodyPr>
+                          </wps:wsp>
+                        </a:graphicData>
+                      </a:graphic>
+                      <wp14:sizeRelH relativeFrom="margin">
+                        <wp14:pctWidth>0</wp14:pctWidth>
+                      </wp14:sizeRelH>
+                      <wp14:sizeRelV relativeFrom="margin">
+                        <wp14:pctHeight>0</wp14:pctHeight>
+                      </wp14:sizeRelV>
+                    </wp:anchor>
+                  </w:drawing>
+                </mc:Choice>
+                <mc:Fallback>
+                  <w:pict>
+                    <v:oval w14:anchorId="4341E49C" id="Ellipse 1" o:spid="_x0000_s1026" style="position:absolute;margin-left:12.15pt;margin-top:16.25pt;width:6pt;height:6.5pt;z-index:251659264;visibility:visible;mso-wrap-style:square;mso-width-percent:0;mso-height-percent:0;mso-wrap-distance-left:9pt;mso-wrap-distance-top:0;mso-wrap-distance-right:9pt;mso-wrap-distance-bottom:0;mso-position-horizontal:absolute;mso-position-horizontal-relative:text;mso-position-vertical:absolute;mso-position-vertical-relative:text;mso-width-percent:0;mso-height-percent:0;mso-width-relative:margin;mso-height-relative:margin;v-text-anchor:middle" o:gfxdata="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" fillcolor="white [3212]" strokecolor="black [3200]" strokeweight="1pt">
+                      <v:stroke joinstyle="miter"/>
+                    </v:oval>
+                  </w:pict>
+                </mc:Fallback>
+              </mc:AlternateContent>
+            </w:r>
+          </w:p>
+        </w:tc>
+        <w:tc>
+          <w:tcPr>
+            <w:tcW w:w="2127" w:type="dxa"/>
+            <w:shd w:val="clear" w:color="auto" w:fill="F288B9"/>
+          </w:tcPr>
+          <w:p>
+            <w:pPr>
+              <w:spacing w:before="240" w:after="0" w:line="240" w:lineRule="auto"/>
+              <w:rPr>
+                <w:bCs/>
+              </w:rPr>
+            </w:pPr>
+            <w:r>
+              <w:rPr>
+                <w:bCs/>
+              </w:rPr>
+              <w:t>Meget uenig</w:t>
+            </w:r>
+          </w:p>
+        </w:tc>
+      </w:tr>
+      <w:tr>
+        <w:tc>
+          <w:tcPr>
+            <w:tcW w:w="562" w:type="dxa"/>
+            <w:shd w:val="clear" w:color="auto" w:fill="F288B9"/>
+          </w:tcPr>
+          <w:p>
+            <w:pPr>
+              <w:spacing w:after="0"/>
+              <w:rPr>
+                <w:bCs/>
+                <w:noProof/>
+                <w14:ligatures w14:val="standardContextual"/>
+              </w:rPr>
+            </w:pPr>
+            <w:r>
+              <w:rPr>
+                <w:bCs/>
+                <w:noProof/>
+                <w14:ligatures w14:val="standardContextual"/>
+              </w:rPr>
+              <mc:AlternateContent>
+                <mc:Choice Requires="wps">
+                  <w:drawing>
+                    <wp:anchor distT="0" distB="0" distL="114300" distR="114300" simplePos="0" relativeHeight="251661312" behindDoc="0" locked="0" layoutInCell="1" allowOverlap="1" wp14:anchorId="7A8BCDD2" wp14:editId="6063F6BC">
+                      <wp:simplePos x="0" y="0"/>
+                      <wp:positionH relativeFrom="column">
+                        <wp:posOffset>154305</wp:posOffset>
+                      </wp:positionH>
+                      <wp:positionV relativeFrom="paragraph">
+                        <wp:posOffset>206375</wp:posOffset>
+                      </wp:positionV>
+                      <wp:extent cx="76200" cy="82550"/>
+                      <wp:effectExtent l="0" t="0" r="19050" b="12700"/>
+                      <wp:wrapNone/>
+                      <wp:docPr id="985813399" name="Ellipse 1"/>
+                      <wp:cNvGraphicFramePr/>
+                      <a:graphic xmlns:a="http://schemas.openxmlformats.org/drawingml/2006/main">
+                        <a:graphicData uri="http://schemas.microsoft.com/office/word/2010/wordprocessingShape">
+                          <wps:wsp>
+                            <wps:cNvSpPr/>
+                            <wps:spPr>
+                              <a:xfrm>
+                                <a:off x="0" y="0"/>
+                                <a:ext cx="76200" cy="82550"/>
+                              </a:xfrm>
+                              <a:prstGeom prst="ellipse">
+                                <a:avLst/>
+                              </a:prstGeom>
+                            </wps:spPr>
+                            <wps:style>
+                              <a:lnRef idx="2">
+                                <a:schemeClr val="dk1"/>
+                              </a:lnRef>
+                              <a:fillRef idx="1">
+                                <a:schemeClr val="lt1"/>
+                              </a:fillRef>
+                              <a:effectRef idx="0">
+                                <a:schemeClr val="dk1"/>
+                              </a:effectRef>
+                              <a:fontRef idx="minor">
+                                <a:schemeClr val="dk1"/>
+                              </a:fontRef>
+                            </wps:style>
+                            <wps:bodyPr rot="0" spcFirstLastPara="0" vertOverflow="overflow" horzOverflow="overflow" vert="horz" wrap="square" lIns="91440" tIns="45720" rIns="91440" bIns="45720" numCol="1" spcCol="0" rtlCol="0" fromWordArt="0" anchor="ctr" anchorCtr="0" forceAA="0" compatLnSpc="1">
+                              <a:prstTxWarp prst="textNoShape">
+                                <a:avLst/>
+                              </a:prstTxWarp>
+                              <a:noAutofit/>
+                            </wps:bodyPr>
+                          </wps:wsp>
+                        </a:graphicData>
+                      </a:graphic>
+                      <wp14:sizeRelH relativeFrom="margin">
+                        <wp14:pctWidth>0</wp14:pctWidth>
+                      </wp14:sizeRelH>
+                      <wp14:sizeRelV relativeFrom="margin">
+                        <wp14:pctHeight>0</wp14:pctHeight>
+                      </wp14:sizeRelV>
+                    </wp:anchor>
+                  </w:drawing>
+                </mc:Choice>
+                <mc:Fallback>
+                  <w:pict>
+                    <v:oval w14:anchorId="4D9680CC" id="Ellipse 1" o:spid="_x0000_s1026" style="position:absolute;margin-left:12.15pt;margin-top:16.25pt;width:6pt;height:6.5pt;z-index:251661312;visibility:visible;mso-wrap-style:square;mso-width-percent:0;mso-height-percent:0;mso-wrap-distance-left:9pt;mso-wrap-distance-top:0;mso-wrap-distance-right:9pt;mso-wrap-distance-bottom:0;mso-position-horizontal:absolute;mso-position-horizontal-relative:text;mso-position-vertical:absolute;mso-position-vertical-relative:text;mso-width-percent:0;mso-height-percent:0;mso-width-relative:margin;mso-height-relative:margin;v-text-anchor:middle" o:gfxdata="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" fillcolor="white [3201]" strokecolor="black [3200]" strokeweight="1pt">
+                      <v:stroke joinstyle="miter"/>
+                    </v:oval>
+                  </w:pict>
+                </mc:Fallback>
+              </mc:AlternateContent>
+            </w:r>
+          </w:p>
+        </w:tc>
+        <w:tc>
+          <w:tcPr>
+            <w:tcW w:w="2127" w:type="dxa"/>
+            <w:shd w:val="clear" w:color="auto" w:fill="F288B9"/>
+          </w:tcPr>
+          <w:p>
+            <w:pPr>
+              <w:spacing w:before="240" w:after="0" w:line="240" w:lineRule="auto"/>
+              <w:rPr>
+                <w:bCs/>
+              </w:rPr>
+            </w:pPr>
+            <w:r>
+              <w:rPr>
+                <w:bCs/>
+              </w:rPr>
+              <w:t>U</w:t>
+            </w:r>
+            <w:r>
+              <w:rPr>
+                <w:bCs/>
+              </w:rPr>
+              <w:t>enig</w:t>
+            </w:r>
+          </w:p>
+        </w:tc>
+      </w:tr>
+      <w:tr>
+        <w:tc>
+          <w:tcPr>
+            <w:tcW w:w="562" w:type="dxa"/>
+            <w:shd w:val="clear" w:color="auto" w:fill="F288B9"/>
+          </w:tcPr>
+          <w:p>
+            <w:pPr>
+              <w:spacing w:after="0"/>
+              <w:rPr>
+                <w:bCs/>
+                <w:noProof/>
+                <w14:ligatures w14:val="standardContextual"/>
+              </w:rPr>
+            </w:pPr>
+            <w:r>
+              <w:rPr>
+                <w:bCs/>
+                <w:noProof/>
+                <w14:ligatures w14:val="standardContextual"/>
+              </w:rPr>
+              <mc:AlternateContent>
+                <mc:Choice Requires="wps">
+                  <w:drawing>
+                    <wp:anchor distT="0" distB="0" distL="114300" distR="114300" simplePos="0" relativeHeight="251663360" behindDoc="0" locked="0" layoutInCell="1" allowOverlap="1" wp14:anchorId="5C39D15C" wp14:editId="3121A65E">
+                      <wp:simplePos x="0" y="0"/>
+                      <wp:positionH relativeFrom="column">
+                        <wp:posOffset>154305</wp:posOffset>
+                      </wp:positionH>
+                      <wp:positionV relativeFrom="paragraph">
+                        <wp:posOffset>206375</wp:posOffset>
+                      </wp:positionV>
+                      <wp:extent cx="76200" cy="82550"/>
+                      <wp:effectExtent l="0" t="0" r="19050" b="12700"/>
+                      <wp:wrapNone/>
+                      <wp:docPr id="1536545239" name="Ellipse 1"/>
+                      <wp:cNvGraphicFramePr/>
+                      <a:graphic xmlns:a="http://schemas.openxmlformats.org/drawingml/2006/main">
+                        <a:graphicData uri="http://schemas.microsoft.com/office/word/2010/wordprocessingShape">
+                          <wps:wsp>
+                            <wps:cNvSpPr/>
+                            <wps:spPr>
+                              <a:xfrm>
+                                <a:off x="0" y="0"/>
+                                <a:ext cx="76200" cy="82550"/>
+                              </a:xfrm>
+                              <a:prstGeom prst="ellipse">
+                                <a:avLst/>
+                              </a:prstGeom>
+                            </wps:spPr>
+                            <wps:style>
+                              <a:lnRef idx="2">
+                                <a:schemeClr val="dk1"/>
+                              </a:lnRef>
+                              <a:fillRef idx="1">
+                                <a:schemeClr val="lt1"/>
+                              </a:fillRef>
+                              <a:effectRef idx="0">
+                                <a:schemeClr val="dk1"/>
+                              </a:effectRef>
+                              <a:fontRef idx="minor">
+                                <a:schemeClr val="dk1"/>
+                              </a:fontRef>
+                            </wps:style>
+                            <wps:bodyPr rot="0" spcFirstLastPara="0" vertOverflow="overflow" horzOverflow="overflow" vert="horz" wrap="square" lIns="91440" tIns="45720" rIns="91440" bIns="45720" numCol="1" spcCol="0" rtlCol="0" fromWordArt="0" anchor="ctr" anchorCtr="0" forceAA="0" compatLnSpc="1">
+                              <a:prstTxWarp prst="textNoShape">
+                                <a:avLst/>
+                              </a:prstTxWarp>
+                              <a:noAutofit/>
+                            </wps:bodyPr>
+                          </wps:wsp>
+                        </a:graphicData>
+                      </a:graphic>
+                      <wp14:sizeRelH relativeFrom="margin">
+                        <wp14:pctWidth>0</wp14:pctWidth>
+                      </wp14:sizeRelH>
+                      <wp14:sizeRelV relativeFrom="margin">
+                        <wp14:pctHeight>0</wp14:pctHeight>
+                      </wp14:sizeRelV>
+                    </wp:anchor>
+                  </w:drawing>
+                </mc:Choice>
+                <mc:Fallback>
+                  <w:pict>
+                    <v:oval w14:anchorId="3E6F4D60" id="Ellipse 1" o:spid="_x0000_s1026" style="position:absolute;margin-left:12.15pt;margin-top:16.25pt;width:6pt;height:6.5pt;z-index:251663360;visibility:visible;mso-wrap-style:square;mso-width-percent:0;mso-height-percent:0;mso-wrap-distance-left:9pt;mso-wrap-distance-top:0;mso-wrap-distance-right:9pt;mso-wrap-distance-bottom:0;mso-position-horizontal:absolute;mso-position-horizontal-relative:text;mso-position-vertical:absolute;mso-position-vertical-relative:text;mso-width-percent:0;mso-height-percent:0;mso-width-relative:margin;mso-height-relative:margin;v-text-anchor:middle" o:gfxdata="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" fillcolor="white [3201]" strokecolor="black [3200]" strokeweight="1pt">
+                      <v:stroke joinstyle="miter"/>
+                    </v:oval>
+                  </w:pict>
+                </mc:Fallback>
+              </mc:AlternateContent>
+            </w:r>
+          </w:p>
+        </w:tc>
+        <w:tc>
+          <w:tcPr>
+            <w:tcW w:w="2127" w:type="dxa"/>
+            <w:shd w:val="clear" w:color="auto" w:fill="F288B9"/>
+          </w:tcPr>
+          <w:p>
+            <w:pPr>
+              <w:spacing w:before="240" w:after="0" w:line="240" w:lineRule="auto"/>
+              <w:rPr>
+                <w:bCs/>
+              </w:rPr>
+            </w:pPr>
+            <w:r>
+              <w:rPr>
+                <w:bCs/>
+              </w:rPr>
+              <w:t>Neutral</w:t>
+            </w:r>
+          </w:p>
+        </w:tc>
+      </w:tr>
+      <w:tr>
+        <w:tc>
+          <w:tcPr>
+            <w:tcW w:w="562" w:type="dxa"/>
+            <w:shd w:val="clear" w:color="auto" w:fill="F288B9"/>
+          </w:tcPr>
+          <w:p>
+            <w:pPr>
+              <w:spacing w:after="0"/>
+              <w:rPr>
+                <w:bCs/>
+                <w:noProof/>
+                <w14:ligatures w14:val="standardContextual"/>
+              </w:rPr>
+            </w:pPr>
+            <w:r>
+              <w:rPr>
+                <w:bCs/>
+                <w:noProof/>
+                <w14:ligatures w14:val="standardContextual"/>
+              </w:rPr>
+              <mc:AlternateContent>
+                <mc:Choice Requires="wps">
+                  <w:drawing>
+                    <wp:anchor distT="0" distB="0" distL="114300" distR="114300" simplePos="0" relativeHeight="251665408" behindDoc="0" locked="0" layoutInCell="1" allowOverlap="1" wp14:anchorId="01F0CA81" wp14:editId="0D9561A7">
+                      <wp:simplePos x="0" y="0"/>
+                      <wp:positionH relativeFrom="column">
+                        <wp:posOffset>154305</wp:posOffset>
+                      </wp:positionH>
+                      <wp:positionV relativeFrom="paragraph">
+                        <wp:posOffset>206375</wp:posOffset>
+                      </wp:positionV>
+                      <wp:extent cx="76200" cy="82550"/>
+                      <wp:effectExtent l="0" t="0" r="19050" b="12700"/>
+                      <wp:wrapNone/>
+                      <wp:docPr id="1791297255" name="Ellipse 1"/>
+                      <wp:cNvGraphicFramePr/>
+                      <a:graphic xmlns:a="http://schemas.openxmlformats.org/drawingml/2006/main">
+                        <a:graphicData uri="http://schemas.microsoft.com/office/word/2010/wordprocessingShape">
+                          <wps:wsp>
+                            <wps:cNvSpPr/>
+                            <wps:spPr>
+                              <a:xfrm>
+                                <a:off x="0" y="0"/>
+                                <a:ext cx="76200" cy="82550"/>
+                              </a:xfrm>
+                              <a:prstGeom prst="ellipse">
+                                <a:avLst/>
+                              </a:prstGeom>
+                            </wps:spPr>
+                            <wps:style>
+                              <a:lnRef idx="2">
+                                <a:schemeClr val="dk1"/>
+                              </a:lnRef>
+                              <a:fillRef idx="1">
+                                <a:schemeClr val="lt1"/>
+                              </a:fillRef>
+                              <a:effectRef idx="0">
+                                <a:schemeClr val="dk1"/>
+                              </a:effectRef>
+                              <a:fontRef idx="minor">
+                                <a:schemeClr val="dk1"/>
+                              </a:fontRef>
+                            </wps:style>
+                            <wps:bodyPr rot="0" spcFirstLastPara="0" vertOverflow="overflow" horzOverflow="overflow" vert="horz" wrap="square" lIns="91440" tIns="45720" rIns="91440" bIns="45720" numCol="1" spcCol="0" rtlCol="0" fromWordArt="0" anchor="ctr" anchorCtr="0" forceAA="0" compatLnSpc="1">
+                              <a:prstTxWarp prst="textNoShape">
+                                <a:avLst/>
+                              </a:prstTxWarp>
+                              <a:noAutofit/>
+                            </wps:bodyPr>
+                          </wps:wsp>
+                        </a:graphicData>
+                      </a:graphic>
+                      <wp14:sizeRelH relativeFrom="margin">
+                        <wp14:pctWidth>0</wp14:pctWidth>
+                      </wp14:sizeRelH>
+                      <wp14:sizeRelV relativeFrom="margin">
+                        <wp14:pctHeight>0</wp14:pctHeight>
+                      </wp14:sizeRelV>
+                    </wp:anchor>
+                  </w:drawing>
+                </mc:Choice>
+                <mc:Fallback>
+                  <w:pict>
+                    <v:oval w14:anchorId="19441457" id="Ellipse 1" o:spid="_x0000_s1026" style="position:absolute;margin-left:12.15pt;margin-top:16.25pt;width:6pt;height:6.5pt;z-index:251665408;visibility:visible;mso-wrap-style:square;mso-width-percent:0;mso-height-percent:0;mso-wrap-distance-left:9pt;mso-wrap-distance-top:0;mso-wrap-distance-right:9pt;mso-wrap-distance-bottom:0;mso-position-horizontal:absolute;mso-position-horizontal-relative:text;mso-position-vertical:absolute;mso-position-vertical-relative:text;mso-width-percent:0;mso-height-percent:0;mso-width-relative:margin;mso-height-relative:margin;v-text-anchor:middle" o:gfxdata="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" fillcolor="white [3201]" strokecolor="black [3200]" strokeweight="1pt">
+                      <v:stroke joinstyle="miter"/>
+                    </v:oval>
+                  </w:pict>
+                </mc:Fallback>
+              </mc:AlternateContent>
+            </w:r>
+          </w:p>
+        </w:tc>
+        <w:tc>
+          <w:tcPr>
+            <w:tcW w:w="2127" w:type="dxa"/>
+            <w:shd w:val="clear" w:color="auto" w:fill="F288B9"/>
+          </w:tcPr>
+          <w:p>
+            <w:pPr>
+              <w:spacing w:before="240" w:after="0" w:line="240" w:lineRule="auto"/>
+              <w:rPr>
+                <w:bCs/>
+              </w:rPr>
+            </w:pPr>
+            <w:r>
+              <w:rPr>
+                <w:bCs/>
+              </w:rPr>
+              <w:t>E</w:t>
+            </w:r>
+            <w:r>
+              <w:rPr>
+                <w:bCs/>
+              </w:rPr>
+              <w:t>nig</w:t>
+            </w:r>
+          </w:p>
+        </w:tc>
+      </w:tr>
+      <w:tr>
+        <w:tc>
+          <w:tcPr>
+            <w:tcW w:w="562" w:type="dxa"/>
+            <w:shd w:val="clear" w:color="auto" w:fill="F288B9"/>
+          </w:tcPr>
+          <w:p>
+            <w:pPr>
+              <w:spacing w:after="0"/>
+              <w:rPr>
+                <w:bCs/>
+                <w:noProof/>
+                <w14:ligatures w14:val="standardContextual"/>
+              </w:rPr>
+            </w:pPr>
+            <w:r>
+              <w:rPr>
+                <w:bCs/>
+                <w:noProof/>
+                <w14:ligatures w14:val="standardContextual"/>
+              </w:rPr>
+              <mc:AlternateContent>
+                <mc:Choice Requires="wps">
+                  <w:drawing>
+                    <wp:anchor distT="0" distB="0" distL="114300" distR="114300" simplePos="0" relativeHeight="251667456" behindDoc="0" locked="0" layoutInCell="1" allowOverlap="1" wp14:anchorId="198D6802" wp14:editId="60DBC8BA">
+                      <wp:simplePos x="0" y="0"/>
+                      <wp:positionH relativeFrom="column">
+                        <wp:posOffset>154305</wp:posOffset>
+                      </wp:positionH>
+                      <wp:positionV relativeFrom="paragraph">
+                        <wp:posOffset>206375</wp:posOffset>
+                      </wp:positionV>
+                      <wp:extent cx="76200" cy="82550"/>
+                      <wp:effectExtent l="0" t="0" r="19050" b="12700"/>
+                      <wp:wrapNone/>
+                      <wp:docPr id="958563657" name="Ellipse 1"/>
+                      <wp:cNvGraphicFramePr/>
+                      <a:graphic xmlns:a="http://schemas.openxmlformats.org/drawingml/2006/main">
+                        <a:graphicData uri="http://schemas.microsoft.com/office/word/2010/wordprocessingShape">
+                          <wps:wsp>
+                            <wps:cNvSpPr/>
+                            <wps:spPr>
+                              <a:xfrm>
+                                <a:off x="0" y="0"/>
+                                <a:ext cx="76200" cy="82550"/>
+                              </a:xfrm>
+                              <a:prstGeom prst="ellipse">
+                                <a:avLst/>
+                              </a:prstGeom>
+                            </wps:spPr>
+                            <wps:style>
+                              <a:lnRef idx="2">
+                                <a:schemeClr val="dk1"/>
+                              </a:lnRef>
+                              <a:fillRef idx="1">
+                                <a:schemeClr val="lt1"/>
+                              </a:fillRef>
+                              <a:effectRef idx="0">
+                                <a:schemeClr val="dk1"/>
+                              </a:effectRef>
+                              <a:fontRef idx="minor">
+                                <a:schemeClr val="dk1"/>
+                              </a:fontRef>
+                            </wps:style>
+                            <wps:bodyPr rot="0" spcFirstLastPara="0" vertOverflow="overflow" horzOverflow="overflow" vert="horz" wrap="square" lIns="91440" tIns="45720" rIns="91440" bIns="45720" numCol="1" spcCol="0" rtlCol="0" fromWordArt="0" anchor="ctr" anchorCtr="0" forceAA="0" compatLnSpc="1">
+                              <a:prstTxWarp prst="textNoShape">
+                                <a:avLst/>
+                              </a:prstTxWarp>
+                              <a:noAutofit/>
+                            </wps:bodyPr>
+                          </wps:wsp>
+                        </a:graphicData>
+                      </a:graphic>
+                      <wp14:sizeRelH relativeFrom="margin">
+                        <wp14:pctWidth>0</wp14:pctWidth>
+                      </wp14:sizeRelH>
+                      <wp14:sizeRelV relativeFrom="margin">
+                        <wp14:pctHeight>0</wp14:pctHeight>
+                      </wp14:sizeRelV>
+                    </wp:anchor>
+                  </w:drawing>
+                </mc:Choice>
+                <mc:Fallback>
+                  <w:pict>
+                    <v:oval w14:anchorId="7D00869E" id="Ellipse 1" o:spid="_x0000_s1026" style="position:absolute;margin-left:12.15pt;margin-top:16.25pt;width:6pt;height:6.5pt;z-index:251667456;visibility:visible;mso-wrap-style:square;mso-width-percent:0;mso-height-percent:0;mso-wrap-distance-left:9pt;mso-wrap-distance-top:0;mso-wrap-distance-right:9pt;mso-wrap-distance-bottom:0;mso-position-horizontal:absolute;mso-position-horizontal-relative:text;mso-position-vertical:absolute;mso-position-vertical-relative:text;mso-width-percent:0;mso-height-percent:0;mso-width-relative:margin;mso-height-relative:margin;v-text-anchor:middle" o:gfxdata="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" fillcolor="white [3201]" strokecolor="black [3200]" strokeweight="1pt">
+                      <v:stroke joinstyle="miter"/>
+                    </v:oval>
+                  </w:pict>
+                </mc:Fallback>
+              </mc:AlternateContent>
+            </w:r>
+          </w:p>
+        </w:tc>
+        <w:tc>
+          <w:tcPr>
+            <w:tcW w:w="2127" w:type="dxa"/>
+            <w:shd w:val="clear" w:color="auto" w:fill="F288B9"/>
+          </w:tcPr>
+          <w:p>
+            <w:pPr>
+              <w:spacing w:before="240" w:line="240" w:lineRule="auto"/>
+              <w:rPr>
+                <w:bCs/>
+              </w:rPr>
+            </w:pPr>
+            <w:r>
+              <w:rPr>
+                <w:bCs/>
+              </w:rPr>
+              <w:t>Meget</w:t>
+            </w:r>
+            <w:r>
+              <w:rPr>
+                <w:bCs/>
+              </w:rPr>
+              <w:t xml:space="preserve"> </w:t>
+            </w:r>
+            <w:r>
+              <w:rPr>
+                <w:bCs/>
+              </w:rPr>
+              <w:t>enig</w:t>
+            </w:r>
+          </w:p>
+        </w:tc>
+      </w:tr>
+    </w:tbl>
+    <w:p>
+      <w:pPr>
+        <w:rPr>
+          <w:bCs/>
         </w:rPr>
       </w:pPr>
     </w:p>
-    <w:p>
-      <w:pPr>
-        <w:rPr>
-          <w:lang w:val="en-US"/>
-        </w:rPr>
-      </w:pPr>
-    </w:p>
+    <w:p/>
+    <w:p/>
+    <w:p/>
+    <w:p/>
+    <w:p/>
+    <w:p/>
+    <w:p/>
     <w:sectPr>
       <w:pgSz w:w="11906" w:h="16838"/>
       <w:pgMar w:top="1701" w:right="1134" w:bottom="1701" w:left="1134" w:header="708" w:footer="708" w:gutter="0"/>
@@ -851,6 +1547,7 @@
   <w:style w:type="character" w:default="1" w:styleId="Standardskrifttypeiafsnit">
     <w:name w:val="Default Paragraph Font"/>
     <w:uiPriority w:val="1"/>
+    <w:semiHidden/>
     <w:unhideWhenUsed/>
   </w:style>
   <w:style w:type="table" w:default="1" w:styleId="Tabel-Normal">
@@ -1217,6 +1914,25 @@
       <w:color w:val="96607D" w:themeColor="followedHyperlink"/>
       <w:u w:val="single"/>
     </w:rPr>
+  </w:style>
+  <w:style w:type="table" w:styleId="Tabel-Gitter">
+    <w:name w:val="Table Grid"/>
+    <w:basedOn w:val="Tabel-Normal"/>
+    <w:uiPriority w:val="39"/>
+    <w:rsid w:val="00F70F55"/>
+    <w:pPr>
+      <w:spacing w:after="0" w:line="240" w:lineRule="auto"/>
+    </w:pPr>
+    <w:tblPr>
+      <w:tblBorders>
+        <w:top w:val="single" w:sz="4" w:space="0" w:color="auto"/>
+        <w:left w:val="single" w:sz="4" w:space="0" w:color="auto"/>
+        <w:bottom w:val="single" w:sz="4" w:space="0" w:color="auto"/>
+        <w:right w:val="single" w:sz="4" w:space="0" w:color="auto"/>
+        <w:insideH w:val="single" w:sz="4" w:space="0" w:color="auto"/>
+        <w:insideV w:val="single" w:sz="4" w:space="0" w:color="auto"/>
+      </w:tblBorders>
+    </w:tblPr>
   </w:style>
 </w:styles>
 </file>

</xml_diff>